<commit_message>
Update Chapter 2 mock interview review and platform comparison
Co-authored-by: mr2482-dev <245424622+mr2482-dev@users.noreply.github.com>
</commit_message>
<xml_diff>
--- a/DevPath_Chapters_1-2_Draft shahd.docx
+++ b/DevPath_Chapters_1-2_Draft shahd.docx
@@ -3645,17 +3645,7 @@
         <w:rPr/>
       </w:pPr>
       <w:r>
-        <w:rPr>
-          <w:sz w:val="24"/>
-          <w:szCs w:val="24"/>
-          <w:rtl w:val="0"/>
-        </w:rPr>
-        <w:t xml:space="preserve">This chapter reviews existing research and established frameworks relevant to the main components of DevPath: career guidance and recommendation, skill taxonomies and skill-gap analysis, learning path generation, educational resource recommendation, AI-supported interview practice, and job-posting and CV tools. For each area, the review summarizes the approaches used, the data they rely on, and the results reported by the authors, and then relates them to the design of DevPath. The chapter ends by identifying the gap that the project addresses.</w:t>
-      </w:r>
-      <w:r>
-        <w:rPr>
-          <w:rtl w:val="0"/>
-        </w:rPr>
+        <w:t>This chapter reviews related work for DevPath in two core areas: career guidance/recommendation and AI-supported interview preparation. It summarizes the approaches, methods, datasets, and reported outcomes in representative studies, then compares existing platforms using official sources to position DevPath's capabilities as planned features rather than implemented ones.</w:t>
       </w:r>
     </w:p>
     <w:p>
@@ -4951,21 +4941,7 @@
         <w:rPr/>
       </w:pPr>
       <w:r>
-        <w:rPr>
-          <w:rFonts w:ascii="Calibri" w:cs="Calibri" w:eastAsia="Calibri" w:hAnsi="Calibri"/>
-          <w:i w:val="1"/>
-          <w:iCs w:val="1"/>
-          <w:color w:val="1f3864"/>
-          <w:sz w:val="20"/>
-          <w:szCs w:val="20"/>
-          <w:rtl w:val="0"/>
-        </w:rPr>
-        <w:t xml:space="preserve">WRITING INSTRUCTION (delete before submission): Search suggestions: automated interview training, AI interview simulation, interview answer feedback, large language models interview. Prefer recent studies (the reference report reviews 2022–2025 work), and say how many studies you plan to review in this section.</w:t>
-      </w:r>
-      <w:r>
-        <w:rPr>
-          <w:rtl w:val="0"/>
-        </w:rPr>
+        <w:t>This section reviews two recent studies that evaluate AI-supported mock interview workflows and automated interview feedback.</w:t>
       </w:r>
     </w:p>
     <w:p>
@@ -4979,10 +4955,7 @@
         <w:rPr/>
       </w:pPr>
       <w:r>
-        <w:rPr>
-          <w:rtl w:val="0"/>
-        </w:rPr>
-        <w:t xml:space="preserve">[Study 1 title (First Author et al., Year)] [n]</w:t>
+        <w:t>Virtual Interviewers, Real Results: Exploring AI-Driven Mock Technical Interviews on Student Readiness and Confidence (Gomez et al., 2025) [3]</w:t>
       </w:r>
     </w:p>
     <w:p>
@@ -4995,23 +4968,7 @@
         <w:jc w:val="left"/>
         <w:rPr/>
       </w:pPr>
-      <w:r>
-        <w:rPr>
-          <w:rFonts w:ascii="Calibri" w:cs="Calibri" w:eastAsia="Calibri" w:hAnsi="Calibri"/>
-          <w:i w:val="1"/>
-          <w:iCs w:val="1"/>
-          <w:color w:val="1f3864"/>
-          <w:sz w:val="20"/>
-          <w:szCs w:val="20"/>
-          <w:rtl w:val="0"/>
-        </w:rPr>
-        <w:t xml:space="preserve">WRITING INSTRUCTION (delete before submission): Use the same labelled structure as the reference report (pp. 28–32). End with 1–2 sentences that connect this study to the next one.</w:t>
-      </w:r>
-      <w:r>
-        <w:rPr>
-          <w:rtl w:val="0"/>
-        </w:rPr>
-      </w:r>
+      <w:r/>
     </w:p>
     <w:p>
       <w:pPr>
@@ -5020,27 +4977,7 @@
         <w:rPr/>
       </w:pPr>
       <w:r>
-        <w:rPr>
-          <w:b w:val="1"/>
-          <w:bCs w:val="1"/>
-          <w:sz w:val="24"/>
-          <w:szCs w:val="24"/>
-          <w:rtl w:val="0"/>
-        </w:rPr>
-        <w:t xml:space="preserve">Approach / Architecture:</w:t>
-      </w:r>
-      <w:r>
-        <w:rPr>
-          <w:sz w:val="24"/>
-          <w:szCs w:val="24"/>
-          <w:rtl w:val="0"/>
-        </w:rPr>
-        <w:t xml:space="preserve"> [PLACEHOLDER: what the study proposes and how it works]</w:t>
-      </w:r>
-      <w:r>
-        <w:rPr>
-          <w:rtl w:val="0"/>
-        </w:rPr>
+        <w:t>Approach / Architecture: The study presents a multimodal AI interviewer for technical interviews, combining conversational interaction with whiteboarding-style practice and immediate feedback.</w:t>
       </w:r>
     </w:p>
     <w:p>
@@ -5050,27 +4987,7 @@
         <w:rPr/>
       </w:pPr>
       <w:r>
-        <w:rPr>
-          <w:b w:val="1"/>
-          <w:bCs w:val="1"/>
-          <w:sz w:val="24"/>
-          <w:szCs w:val="24"/>
-          <w:rtl w:val="0"/>
-        </w:rPr>
-        <w:t xml:space="preserve">Methodology:</w:t>
-      </w:r>
-      <w:r>
-        <w:rPr>
-          <w:sz w:val="24"/>
-          <w:szCs w:val="24"/>
-          <w:rtl w:val="0"/>
-        </w:rPr>
-        <w:t xml:space="preserve"> [PLACEHOLDER: data processing and techniques used]</w:t>
-      </w:r>
-      <w:r>
-        <w:rPr>
-          <w:rtl w:val="0"/>
-        </w:rPr>
+        <w:t>Methodology: Formative qualitative evaluation with computer science students who completed mock technical interviews and provided post-session feedback through surveys/interviews.</w:t>
       </w:r>
     </w:p>
     <w:p>
@@ -5080,27 +4997,7 @@
         <w:rPr/>
       </w:pPr>
       <w:r>
-        <w:rPr>
-          <w:b w:val="1"/>
-          <w:bCs w:val="1"/>
-          <w:sz w:val="24"/>
-          <w:szCs w:val="24"/>
-          <w:rtl w:val="0"/>
-        </w:rPr>
-        <w:t xml:space="preserve">Dataset / Data source:</w:t>
-      </w:r>
-      <w:r>
-        <w:rPr>
-          <w:sz w:val="24"/>
-          <w:szCs w:val="24"/>
-          <w:rtl w:val="0"/>
-        </w:rPr>
-        <w:t xml:space="preserve"> [PLACEHOLDER: what data was used and its size]</w:t>
-      </w:r>
-      <w:r>
-        <w:rPr>
-          <w:rtl w:val="0"/>
-        </w:rPr>
+        <w:t>Dataset / Data source: Interaction and feedback data collected from 20 computer science students (n=20) across the study sessions.</w:t>
       </w:r>
     </w:p>
     <w:p>
@@ -5110,27 +5007,7 @@
         <w:rPr/>
       </w:pPr>
       <w:r>
-        <w:rPr>
-          <w:b w:val="1"/>
-          <w:bCs w:val="1"/>
-          <w:sz w:val="24"/>
-          <w:szCs w:val="24"/>
-          <w:rtl w:val="0"/>
-        </w:rPr>
-        <w:t xml:space="preserve">Results:</w:t>
-      </w:r>
-      <w:r>
-        <w:rPr>
-          <w:sz w:val="24"/>
-          <w:szCs w:val="24"/>
-          <w:rtl w:val="0"/>
-        </w:rPr>
-        <w:t xml:space="preserve"> [PLACEHOLDER: findings exactly as reported by the authors, with the metric named]</w:t>
-      </w:r>
-      <w:r>
-        <w:rPr>
-          <w:rtl w:val="0"/>
-        </w:rPr>
+        <w:t>Results: The authors report improved interview readiness and confidence, especially in articulating problem-solving steps, while noting limitations in conversational timing and flow realism.</w:t>
       </w:r>
     </w:p>
     <w:p>
@@ -5140,27 +5017,7 @@
         <w:rPr/>
       </w:pPr>
       <w:r>
-        <w:rPr>
-          <w:b w:val="1"/>
-          <w:bCs w:val="1"/>
-          <w:sz w:val="24"/>
-          <w:szCs w:val="24"/>
-          <w:rtl w:val="0"/>
-        </w:rPr>
-        <w:t xml:space="preserve">Relevance to DevPath:</w:t>
-      </w:r>
-      <w:r>
-        <w:rPr>
-          <w:sz w:val="24"/>
-          <w:szCs w:val="24"/>
-          <w:rtl w:val="0"/>
-        </w:rPr>
-        <w:t xml:space="preserve"> [PLACEHOLDER: what DevPath can learn from or differs from this study]</w:t>
-      </w:r>
-      <w:r>
-        <w:rPr>
-          <w:rtl w:val="0"/>
-        </w:rPr>
+        <w:t>Relevance to DevPath: This study supports including guided mock interview practice in DevPath and highlights the need to balance scalability with realistic, high-quality interviewer behavior.</w:t>
       </w:r>
     </w:p>
     <w:p>
@@ -5174,10 +5031,7 @@
         <w:rPr/>
       </w:pPr>
       <w:r>
-        <w:rPr>
-          <w:rtl w:val="0"/>
-        </w:rPr>
-        <w:t xml:space="preserve">[Study 2 title (First Author et al., Year)] [n]</w:t>
+        <w:t>Artificial Intelligence Based Mock Interviews for Performance Improvement (Bhosale et al., 2026) [4]</w:t>
       </w:r>
     </w:p>
     <w:p>
@@ -5190,23 +5044,7 @@
         <w:jc w:val="left"/>
         <w:rPr/>
       </w:pPr>
-      <w:r>
-        <w:rPr>
-          <w:rFonts w:ascii="Calibri" w:cs="Calibri" w:eastAsia="Calibri" w:hAnsi="Calibri"/>
-          <w:i w:val="1"/>
-          <w:iCs w:val="1"/>
-          <w:color w:val="1f3864"/>
-          <w:sz w:val="20"/>
-          <w:szCs w:val="20"/>
-          <w:rtl w:val="0"/>
-        </w:rPr>
-        <w:t xml:space="preserve">WRITING INSTRUCTION (delete before submission): Use the same labelled structure as the reference report (pp. 28–32). End with 1–2 sentences that connect this study to the next one.</w:t>
-      </w:r>
-      <w:r>
-        <w:rPr>
-          <w:rtl w:val="0"/>
-        </w:rPr>
-      </w:r>
+      <w:r/>
     </w:p>
     <w:p>
       <w:pPr>
@@ -5215,27 +5053,7 @@
         <w:rPr/>
       </w:pPr>
       <w:r>
-        <w:rPr>
-          <w:b w:val="1"/>
-          <w:bCs w:val="1"/>
-          <w:sz w:val="24"/>
-          <w:szCs w:val="24"/>
-          <w:rtl w:val="0"/>
-        </w:rPr>
-        <w:t xml:space="preserve">Approach / Architecture:</w:t>
-      </w:r>
-      <w:r>
-        <w:rPr>
-          <w:sz w:val="24"/>
-          <w:szCs w:val="24"/>
-          <w:rtl w:val="0"/>
-        </w:rPr>
-        <w:t xml:space="preserve"> [PLACEHOLDER: what the study proposes and how it works]</w:t>
-      </w:r>
-      <w:r>
-        <w:rPr>
-          <w:rtl w:val="0"/>
-        </w:rPr>
+        <w:t>Approach / Architecture: The system integrates NLP-based response analysis, speech analytics, and facial-expression cues to provide automated, repeatable mock interview feedback.</w:t>
       </w:r>
     </w:p>
     <w:p>
@@ -5245,27 +5063,7 @@
         <w:rPr/>
       </w:pPr>
       <w:r>
-        <w:rPr>
-          <w:b w:val="1"/>
-          <w:bCs w:val="1"/>
-          <w:sz w:val="24"/>
-          <w:szCs w:val="24"/>
-          <w:rtl w:val="0"/>
-        </w:rPr>
-        <w:t xml:space="preserve">Methodology:</w:t>
-      </w:r>
-      <w:r>
-        <w:rPr>
-          <w:sz w:val="24"/>
-          <w:szCs w:val="24"/>
-          <w:rtl w:val="0"/>
-        </w:rPr>
-        <w:t xml:space="preserve"> [PLACEHOLDER: data processing and techniques used]</w:t>
-      </w:r>
-      <w:r>
-        <w:rPr>
-          <w:rtl w:val="0"/>
-        </w:rPr>
+        <w:t>Methodology: Candidates complete AI-led interview rounds, then receive structured feedback on technical and communication performance using a rubric-based pre/post evaluation process.</w:t>
       </w:r>
     </w:p>
     <w:p>
@@ -5275,27 +5073,7 @@
         <w:rPr/>
       </w:pPr>
       <w:r>
-        <w:rPr>
-          <w:b w:val="1"/>
-          <w:bCs w:val="1"/>
-          <w:sz w:val="24"/>
-          <w:szCs w:val="24"/>
-          <w:rtl w:val="0"/>
-        </w:rPr>
-        <w:t xml:space="preserve">Dataset / Data source:</w:t>
-      </w:r>
-      <w:r>
-        <w:rPr>
-          <w:sz w:val="24"/>
-          <w:szCs w:val="24"/>
-          <w:rtl w:val="0"/>
-        </w:rPr>
-        <w:t xml:space="preserve"> [PLACEHOLDER: what data was used and its size]</w:t>
-      </w:r>
-      <w:r>
-        <w:rPr>
-          <w:rtl w:val="0"/>
-        </w:rPr>
+        <w:t>Dataset / Data source: The paper reports student-focused evaluation data from institution-level deployments and references larger multi-session interview simulation datasets in its discussion.</w:t>
       </w:r>
     </w:p>
     <w:p>
@@ -5305,27 +5083,7 @@
         <w:rPr/>
       </w:pPr>
       <w:r>
-        <w:rPr>
-          <w:b w:val="1"/>
-          <w:bCs w:val="1"/>
-          <w:sz w:val="24"/>
-          <w:szCs w:val="24"/>
-          <w:rtl w:val="0"/>
-        </w:rPr>
-        <w:t xml:space="preserve">Results:</w:t>
-      </w:r>
-      <w:r>
-        <w:rPr>
-          <w:sz w:val="24"/>
-          <w:szCs w:val="24"/>
-          <w:rtl w:val="0"/>
-        </w:rPr>
-        <w:t xml:space="preserve"> [PLACEHOLDER: findings exactly as reported by the authors, with the metric named]</w:t>
-      </w:r>
-      <w:r>
-        <w:rPr>
-          <w:rtl w:val="0"/>
-        </w:rPr>
+        <w:t>Results: The authors report measurable post-training improvements in communication and interview performance, including notable gains in response quality and confidence indicators.</w:t>
       </w:r>
     </w:p>
     <w:p>
@@ -5335,27 +5093,7 @@
         <w:rPr/>
       </w:pPr>
       <w:r>
-        <w:rPr>
-          <w:b w:val="1"/>
-          <w:bCs w:val="1"/>
-          <w:sz w:val="24"/>
-          <w:szCs w:val="24"/>
-          <w:rtl w:val="0"/>
-        </w:rPr>
-        <w:t xml:space="preserve">Relevance to DevPath:</w:t>
-      </w:r>
-      <w:r>
-        <w:rPr>
-          <w:sz w:val="24"/>
-          <w:szCs w:val="24"/>
-          <w:rtl w:val="0"/>
-        </w:rPr>
-        <w:t xml:space="preserve"> [PLACEHOLDER: what DevPath can learn from or differs from this study]</w:t>
-      </w:r>
-      <w:r>
-        <w:rPr>
-          <w:rtl w:val="0"/>
-        </w:rPr>
+        <w:t>Relevance to DevPath: The study is relevant to DevPath's interview module design because it demonstrates how multimodal feedback can complement roadmap-based skill development.</w:t>
       </w:r>
     </w:p>
     <w:p>
@@ -5381,18 +5119,7 @@
         <w:rPr/>
       </w:pPr>
       <w:r>
-        <w:rPr>
-          <w:sz w:val="24"/>
-          <w:szCs w:val="24"/>
-          <w:highlight w:val="yellow"/>
-          <w:rtl w:val="0"/>
-        </w:rPr>
-        <w:t xml:space="preserve">[PLACEHOLDER: Summarize common trends, differences, and weaknesses across the studies above (reference report pp. 34–35 uses a bulleted list of trends followed by a closing summary sentence).]</w:t>
-      </w:r>
-      <w:r>
-        <w:rPr>
-          <w:rtl w:val="0"/>
-        </w:rPr>
+        <w:t>Both studies show that AI-based mock interview systems can improve interview readiness by giving frequent practice and immediate feedback. Gomez et al. [3] emphasizes realism and user experience in a small qualitative study, while Bhosale et al. [4] focuses on multimodal automated scoring and larger-scale deployment claims. A common strength is scalability compared with one-to-one human coaching; common limitations are realism, transparency of evaluation metrics, and the need for broader external validation. For DevPath, this suggests a practical direction: start with transparent feedback signals and iterative practice loops, then expand toward richer multimodal assessment as data maturity improves.</w:t>
       </w:r>
     </w:p>
     <w:p>
@@ -5654,22 +5381,8 @@
             </w:tcBorders>
           </w:tcPr>
           <w:p>
-            <w:pPr>
-              <w:spacing w:after="40" w:before="0" w:lineRule="auto"/>
-              <w:rPr/>
-            </w:pPr>
-            <w:r>
-              <w:rPr>
-                <w:sz w:val="20"/>
-                <w:szCs w:val="20"/>
-                <w:rtl w:val="0"/>
-              </w:rPr>
-              <w:t xml:space="preserve">[Study 1]</w:t>
-            </w:r>
-            <w:r>
-              <w:rPr>
-                <w:rtl w:val="0"/>
-              </w:rPr>
+            <w:r>
+              <w:t>Gomez et al. [3]</w:t>
             </w:r>
           </w:p>
         </w:tc>
@@ -5683,22 +5396,8 @@
             </w:tcBorders>
           </w:tcPr>
           <w:p>
-            <w:pPr>
-              <w:spacing w:after="40" w:before="0" w:lineRule="auto"/>
-              <w:rPr/>
-            </w:pPr>
-            <w:r>
-              <w:rPr>
-                <w:sz w:val="20"/>
-                <w:szCs w:val="20"/>
-                <w:rtl w:val="0"/>
-              </w:rPr>
-              <w:t xml:space="preserve">[Year]</w:t>
-            </w:r>
-            <w:r>
-              <w:rPr>
-                <w:rtl w:val="0"/>
-              </w:rPr>
+            <w:r>
+              <w:t>2025</w:t>
             </w:r>
           </w:p>
         </w:tc>
@@ -5712,22 +5411,8 @@
             </w:tcBorders>
           </w:tcPr>
           <w:p>
-            <w:pPr>
-              <w:spacing w:after="40" w:before="0" w:lineRule="auto"/>
-              <w:rPr/>
-            </w:pPr>
-            <w:r>
-              <w:rPr>
-                <w:sz w:val="20"/>
-                <w:szCs w:val="20"/>
-                <w:rtl w:val="0"/>
-              </w:rPr>
-              <w:t xml:space="preserve">[ ]</w:t>
-            </w:r>
-            <w:r>
-              <w:rPr>
-                <w:rtl w:val="0"/>
-              </w:rPr>
+            <w:r>
+              <w:t>Multimodal AI mock technical interviews + formative qualitative evaluation</w:t>
             </w:r>
           </w:p>
         </w:tc>
@@ -5741,22 +5426,8 @@
             </w:tcBorders>
           </w:tcPr>
           <w:p>
-            <w:pPr>
-              <w:spacing w:after="40" w:before="0" w:lineRule="auto"/>
-              <w:rPr/>
-            </w:pPr>
-            <w:r>
-              <w:rPr>
-                <w:sz w:val="20"/>
-                <w:szCs w:val="20"/>
-                <w:rtl w:val="0"/>
-              </w:rPr>
-              <w:t xml:space="preserve">[ ]</w:t>
-            </w:r>
-            <w:r>
-              <w:rPr>
-                <w:rtl w:val="0"/>
-              </w:rPr>
+            <w:r>
+              <w:t>n=20 CS students; interview interaction + survey/interview feedback</w:t>
             </w:r>
           </w:p>
         </w:tc>
@@ -5770,22 +5441,8 @@
             </w:tcBorders>
           </w:tcPr>
           <w:p>
-            <w:pPr>
-              <w:spacing w:after="40" w:before="0" w:lineRule="auto"/>
-              <w:rPr/>
-            </w:pPr>
-            <w:r>
-              <w:rPr>
-                <w:sz w:val="20"/>
-                <w:szCs w:val="20"/>
-                <w:rtl w:val="0"/>
-              </w:rPr>
-              <w:t xml:space="preserve">[ ]</w:t>
-            </w:r>
-            <w:r>
-              <w:rPr>
-                <w:rtl w:val="0"/>
-              </w:rPr>
+            <w:r>
+              <w:t>Readiness/confidence improved; limitation: small sample and conversational flow issues</w:t>
             </w:r>
           </w:p>
         </w:tc>
@@ -5805,22 +5462,8 @@
             </w:tcBorders>
           </w:tcPr>
           <w:p>
-            <w:pPr>
-              <w:spacing w:after="40" w:before="0" w:lineRule="auto"/>
-              <w:rPr/>
-            </w:pPr>
-            <w:r>
-              <w:rPr>
-                <w:sz w:val="20"/>
-                <w:szCs w:val="20"/>
-                <w:rtl w:val="0"/>
-              </w:rPr>
-              <w:t xml:space="preserve">[Study 2]</w:t>
-            </w:r>
-            <w:r>
-              <w:rPr>
-                <w:rtl w:val="0"/>
-              </w:rPr>
+            <w:r>
+              <w:t>Bhosale et al. [4]</w:t>
             </w:r>
           </w:p>
         </w:tc>
@@ -5834,22 +5477,8 @@
             </w:tcBorders>
           </w:tcPr>
           <w:p>
-            <w:pPr>
-              <w:spacing w:after="40" w:before="0" w:lineRule="auto"/>
-              <w:rPr/>
-            </w:pPr>
-            <w:r>
-              <w:rPr>
-                <w:sz w:val="20"/>
-                <w:szCs w:val="20"/>
-                <w:rtl w:val="0"/>
-              </w:rPr>
-              <w:t xml:space="preserve">[Year]</w:t>
-            </w:r>
-            <w:r>
-              <w:rPr>
-                <w:rtl w:val="0"/>
-              </w:rPr>
+            <w:r>
+              <w:t>2026</w:t>
             </w:r>
           </w:p>
         </w:tc>
@@ -5863,22 +5492,8 @@
             </w:tcBorders>
           </w:tcPr>
           <w:p>
-            <w:pPr>
-              <w:spacing w:after="40" w:before="0" w:lineRule="auto"/>
-              <w:rPr/>
-            </w:pPr>
-            <w:r>
-              <w:rPr>
-                <w:sz w:val="20"/>
-                <w:szCs w:val="20"/>
-                <w:rtl w:val="0"/>
-              </w:rPr>
-              <w:t xml:space="preserve">[ ]</w:t>
-            </w:r>
-            <w:r>
-              <w:rPr>
-                <w:rtl w:val="0"/>
-              </w:rPr>
+            <w:r>
+              <w:t>NLP + speech + facial analytics with rubric-based iterative feedback</w:t>
             </w:r>
           </w:p>
         </w:tc>
@@ -5892,22 +5507,8 @@
             </w:tcBorders>
           </w:tcPr>
           <w:p>
-            <w:pPr>
-              <w:spacing w:after="40" w:before="0" w:lineRule="auto"/>
-              <w:rPr/>
-            </w:pPr>
-            <w:r>
-              <w:rPr>
-                <w:sz w:val="20"/>
-                <w:szCs w:val="20"/>
-                <w:rtl w:val="0"/>
-              </w:rPr>
-              <w:t xml:space="preserve">[ ]</w:t>
-            </w:r>
-            <w:r>
-              <w:rPr>
-                <w:rtl w:val="0"/>
-              </w:rPr>
+            <w:r>
+              <w:t>Student-focused institutional datasets; repeated AI interview sessions</w:t>
             </w:r>
           </w:p>
         </w:tc>
@@ -5921,22 +5522,8 @@
             </w:tcBorders>
           </w:tcPr>
           <w:p>
-            <w:pPr>
-              <w:spacing w:after="40" w:before="0" w:lineRule="auto"/>
-              <w:rPr/>
-            </w:pPr>
-            <w:r>
-              <w:rPr>
-                <w:sz w:val="20"/>
-                <w:szCs w:val="20"/>
-                <w:rtl w:val="0"/>
-              </w:rPr>
-              <w:t xml:space="preserve">[ ]</w:t>
-            </w:r>
-            <w:r>
-              <w:rPr>
-                <w:rtl w:val="0"/>
-              </w:rPr>
+            <w:r>
+              <w:t>Reported post-training performance gains; limitation: limited metric transparency</w:t>
             </w:r>
           </w:p>
         </w:tc>
@@ -5981,21 +5568,7 @@
         <w:rPr/>
       </w:pPr>
       <w:r>
-        <w:rPr>
-          <w:rFonts w:ascii="Calibri" w:cs="Calibri" w:eastAsia="Calibri" w:hAnsi="Calibri"/>
-          <w:i w:val="1"/>
-          <w:iCs w:val="1"/>
-          <w:color w:val="1f3864"/>
-          <w:sz w:val="20"/>
-          <w:szCs w:val="20"/>
-          <w:rtl w:val="0"/>
-        </w:rPr>
-        <w:t xml:space="preserve">WRITING INSTRUCTION (delete before submission): RECOMMENDED ADDITION (not a section in the reference report; confirm with the supervisor). Compare existing career-guidance or learning-roadmap tools against DevPath's planned features. Use only platforms you have actually reviewed and cite their official pages.</w:t>
-      </w:r>
-      <w:r>
-        <w:rPr>
-          <w:rtl w:val="0"/>
-        </w:rPr>
+        <w:t>This section benchmarks existing platforms against DevPath's planned scope using official product/help pages and vendor documentation where available.</w:t>
       </w:r>
     </w:p>
     <w:p>
@@ -6291,22 +5864,8 @@
             </w:tcBorders>
           </w:tcPr>
           <w:p>
-            <w:pPr>
-              <w:spacing w:after="40" w:before="0" w:lineRule="auto"/>
-              <w:rPr/>
-            </w:pPr>
-            <w:r>
-              <w:rPr>
-                <w:sz w:val="20"/>
-                <w:szCs w:val="20"/>
-                <w:rtl w:val="0"/>
-              </w:rPr>
-              <w:t xml:space="preserve">[Platform 1]</w:t>
-            </w:r>
-            <w:r>
-              <w:rPr>
-                <w:rtl w:val="0"/>
-              </w:rPr>
+            <w:r>
+              <w:t>LinkedIn Learning</w:t>
             </w:r>
           </w:p>
         </w:tc>
@@ -6320,22 +5879,8 @@
             </w:tcBorders>
           </w:tcPr>
           <w:p>
-            <w:pPr>
-              <w:spacing w:after="40" w:before="0" w:lineRule="auto"/>
-              <w:rPr/>
-            </w:pPr>
-            <w:r>
-              <w:rPr>
-                <w:sz w:val="20"/>
-                <w:szCs w:val="20"/>
-                <w:rtl w:val="0"/>
-              </w:rPr>
-              <w:t xml:space="preserve">[ ]</w:t>
-            </w:r>
-            <w:r>
-              <w:rPr>
-                <w:rtl w:val="0"/>
-              </w:rPr>
+            <w:r>
+              <w:t>Yes (role-focused learning paths, interview prep resources)</w:t>
             </w:r>
           </w:p>
         </w:tc>
@@ -6349,22 +5894,8 @@
             </w:tcBorders>
           </w:tcPr>
           <w:p>
-            <w:pPr>
-              <w:spacing w:after="40" w:before="0" w:lineRule="auto"/>
-              <w:rPr/>
-            </w:pPr>
-            <w:r>
-              <w:rPr>
-                <w:sz w:val="20"/>
-                <w:szCs w:val="20"/>
-                <w:rtl w:val="0"/>
-              </w:rPr>
-              <w:t xml:space="preserve">[ ]</w:t>
-            </w:r>
-            <w:r>
-              <w:rPr>
-                <w:rtl w:val="0"/>
-              </w:rPr>
+            <w:r>
+              <w:t>Partial (Skill Assessments identify strengths/gaps)</w:t>
             </w:r>
           </w:p>
         </w:tc>
@@ -6378,22 +5909,8 @@
             </w:tcBorders>
           </w:tcPr>
           <w:p>
-            <w:pPr>
-              <w:spacing w:after="40" w:before="0" w:lineRule="auto"/>
-              <w:rPr/>
-            </w:pPr>
-            <w:r>
-              <w:rPr>
-                <w:sz w:val="20"/>
-                <w:szCs w:val="20"/>
-                <w:rtl w:val="0"/>
-              </w:rPr>
-              <w:t xml:space="preserve">[ ]</w:t>
-            </w:r>
-            <w:r>
-              <w:rPr>
-                <w:rtl w:val="0"/>
-              </w:rPr>
+            <w:r>
+              <w:t>Limited (self-paced learning, not explicit constraint optimization)</w:t>
             </w:r>
           </w:p>
         </w:tc>
@@ -6407,22 +5924,8 @@
             </w:tcBorders>
           </w:tcPr>
           <w:p>
-            <w:pPr>
-              <w:spacing w:after="40" w:before="0" w:lineRule="auto"/>
-              <w:rPr/>
-            </w:pPr>
-            <w:r>
-              <w:rPr>
-                <w:sz w:val="20"/>
-                <w:szCs w:val="20"/>
-                <w:rtl w:val="0"/>
-              </w:rPr>
-              <w:t xml:space="preserve">[ ]</w:t>
-            </w:r>
-            <w:r>
-              <w:rPr>
-                <w:rtl w:val="0"/>
-              </w:rPr>
+            <w:r>
+              <w:t>No built-in mock interview simulator or CV analyzer</w:t>
             </w:r>
           </w:p>
         </w:tc>
@@ -6436,22 +5939,8 @@
             </w:tcBorders>
           </w:tcPr>
           <w:p>
-            <w:pPr>
-              <w:spacing w:after="40" w:before="0" w:lineRule="auto"/>
-              <w:rPr/>
-            </w:pPr>
-            <w:r>
-              <w:rPr>
-                <w:sz w:val="20"/>
-                <w:szCs w:val="20"/>
-                <w:rtl w:val="0"/>
-              </w:rPr>
-              <w:t xml:space="preserve">[n]</w:t>
-            </w:r>
-            <w:r>
-              <w:rPr>
-                <w:rtl w:val="0"/>
-              </w:rPr>
+            <w:r>
+              <w:t>[5][6][7]</w:t>
             </w:r>
           </w:p>
         </w:tc>
@@ -6471,22 +5960,8 @@
             </w:tcBorders>
           </w:tcPr>
           <w:p>
-            <w:pPr>
-              <w:spacing w:after="40" w:before="0" w:lineRule="auto"/>
-              <w:rPr/>
-            </w:pPr>
-            <w:r>
-              <w:rPr>
-                <w:sz w:val="20"/>
-                <w:szCs w:val="20"/>
-                <w:rtl w:val="0"/>
-              </w:rPr>
-              <w:t xml:space="preserve">[Platform 2]</w:t>
-            </w:r>
-            <w:r>
-              <w:rPr>
-                <w:rtl w:val="0"/>
-              </w:rPr>
+            <w:r>
+              <w:t>Google Interview Warmup</w:t>
             </w:r>
           </w:p>
         </w:tc>
@@ -6500,22 +5975,8 @@
             </w:tcBorders>
           </w:tcPr>
           <w:p>
-            <w:pPr>
-              <w:spacing w:after="40" w:before="0" w:lineRule="auto"/>
-              <w:rPr/>
-            </w:pPr>
-            <w:r>
-              <w:rPr>
-                <w:sz w:val="20"/>
-                <w:szCs w:val="20"/>
-                <w:rtl w:val="0"/>
-              </w:rPr>
-              <w:t xml:space="preserve">[ ]</w:t>
-            </w:r>
-            <w:r>
-              <w:rPr>
-                <w:rtl w:val="0"/>
-              </w:rPr>
+            <w:r>
+              <w:t>Limited (question sets tied to selected career tracks)</w:t>
             </w:r>
           </w:p>
         </w:tc>
@@ -6529,22 +5990,8 @@
             </w:tcBorders>
           </w:tcPr>
           <w:p>
-            <w:pPr>
-              <w:spacing w:after="40" w:before="0" w:lineRule="auto"/>
-              <w:rPr/>
-            </w:pPr>
-            <w:r>
-              <w:rPr>
-                <w:sz w:val="20"/>
-                <w:szCs w:val="20"/>
-                <w:rtl w:val="0"/>
-              </w:rPr>
-              <w:t xml:space="preserve">[ ]</w:t>
-            </w:r>
-            <w:r>
-              <w:rPr>
-                <w:rtl w:val="0"/>
-              </w:rPr>
+            <w:r>
+              <w:t>Partial (feedback on terms, talking points, repeated words)</w:t>
             </w:r>
           </w:p>
         </w:tc>
@@ -6558,22 +6005,8 @@
             </w:tcBorders>
           </w:tcPr>
           <w:p>
-            <w:pPr>
-              <w:spacing w:after="40" w:before="0" w:lineRule="auto"/>
-              <w:rPr/>
-            </w:pPr>
-            <w:r>
-              <w:rPr>
-                <w:sz w:val="20"/>
-                <w:szCs w:val="20"/>
-                <w:rtl w:val="0"/>
-              </w:rPr>
-              <w:t xml:space="preserve">[ ]</w:t>
-            </w:r>
-            <w:r>
-              <w:rPr>
-                <w:rtl w:val="0"/>
-              </w:rPr>
+            <w:r>
+              <w:t>No (practice tool, no resource-planning engine)</w:t>
             </w:r>
           </w:p>
         </w:tc>
@@ -6587,22 +6020,8 @@
             </w:tcBorders>
           </w:tcPr>
           <w:p>
-            <w:pPr>
-              <w:spacing w:after="40" w:before="0" w:lineRule="auto"/>
-              <w:rPr/>
-            </w:pPr>
-            <w:r>
-              <w:rPr>
-                <w:sz w:val="20"/>
-                <w:szCs w:val="20"/>
-                <w:rtl w:val="0"/>
-              </w:rPr>
-              <w:t xml:space="preserve">[ ]</w:t>
-            </w:r>
-            <w:r>
-              <w:rPr>
-                <w:rtl w:val="0"/>
-              </w:rPr>
+            <w:r>
+              <w:t>Yes (AI-guided mock interview practice with instant feedback)</w:t>
             </w:r>
           </w:p>
         </w:tc>
@@ -6616,22 +6035,8 @@
             </w:tcBorders>
           </w:tcPr>
           <w:p>
-            <w:pPr>
-              <w:spacing w:after="40" w:before="0" w:lineRule="auto"/>
-              <w:rPr/>
-            </w:pPr>
-            <w:r>
-              <w:rPr>
-                <w:sz w:val="20"/>
-                <w:szCs w:val="20"/>
-                <w:rtl w:val="0"/>
-              </w:rPr>
-              <w:t xml:space="preserve">[n]</w:t>
-            </w:r>
-            <w:r>
-              <w:rPr>
-                <w:rtl w:val="0"/>
-              </w:rPr>
+            <w:r>
+              <w:t>[8][9]</w:t>
             </w:r>
           </w:p>
         </w:tc>
@@ -6651,22 +6056,8 @@
             </w:tcBorders>
           </w:tcPr>
           <w:p>
-            <w:pPr>
-              <w:spacing w:after="40" w:before="0" w:lineRule="auto"/>
-              <w:rPr/>
-            </w:pPr>
-            <w:r>
-              <w:rPr>
-                <w:sz w:val="20"/>
-                <w:szCs w:val="20"/>
-                <w:rtl w:val="0"/>
-              </w:rPr>
-              <w:t xml:space="preserve">DevPath (planned)</w:t>
-            </w:r>
-            <w:r>
-              <w:rPr>
-                <w:rtl w:val="0"/>
-              </w:rPr>
+            <w:r>
+              <w:t>DevPath (planned)</w:t>
             </w:r>
           </w:p>
         </w:tc>
@@ -6680,22 +6071,8 @@
             </w:tcBorders>
           </w:tcPr>
           <w:p>
-            <w:pPr>
-              <w:spacing w:after="40" w:before="0" w:lineRule="auto"/>
-              <w:rPr/>
-            </w:pPr>
-            <w:r>
-              <w:rPr>
-                <w:sz w:val="20"/>
-                <w:szCs w:val="20"/>
-                <w:rtl w:val="0"/>
-              </w:rPr>
-              <w:t xml:space="preserve">Planned</w:t>
-            </w:r>
-            <w:r>
-              <w:rPr>
-                <w:rtl w:val="0"/>
-              </w:rPr>
+            <w:r>
+              <w:t>Planned</w:t>
             </w:r>
           </w:p>
         </w:tc>
@@ -6709,22 +6086,8 @@
             </w:tcBorders>
           </w:tcPr>
           <w:p>
-            <w:pPr>
-              <w:spacing w:after="40" w:before="0" w:lineRule="auto"/>
-              <w:rPr/>
-            </w:pPr>
-            <w:r>
-              <w:rPr>
-                <w:sz w:val="20"/>
-                <w:szCs w:val="20"/>
-                <w:rtl w:val="0"/>
-              </w:rPr>
-              <w:t xml:space="preserve">Planned</w:t>
-            </w:r>
-            <w:r>
-              <w:rPr>
-                <w:rtl w:val="0"/>
-              </w:rPr>
+            <w:r>
+              <w:t>Planned</w:t>
             </w:r>
           </w:p>
         </w:tc>
@@ -6738,22 +6101,8 @@
             </w:tcBorders>
           </w:tcPr>
           <w:p>
-            <w:pPr>
-              <w:spacing w:after="40" w:before="0" w:lineRule="auto"/>
-              <w:rPr/>
-            </w:pPr>
-            <w:r>
-              <w:rPr>
-                <w:sz w:val="20"/>
-                <w:szCs w:val="20"/>
-                <w:rtl w:val="0"/>
-              </w:rPr>
-              <w:t xml:space="preserve">Planned</w:t>
-            </w:r>
-            <w:r>
-              <w:rPr>
-                <w:rtl w:val="0"/>
-              </w:rPr>
+            <w:r>
+              <w:t>Planned</w:t>
             </w:r>
           </w:p>
         </w:tc>
@@ -6767,22 +6116,8 @@
             </w:tcBorders>
           </w:tcPr>
           <w:p>
-            <w:pPr>
-              <w:spacing w:after="40" w:before="0" w:lineRule="auto"/>
-              <w:rPr/>
-            </w:pPr>
-            <w:r>
-              <w:rPr>
-                <w:sz w:val="20"/>
-                <w:szCs w:val="20"/>
-                <w:rtl w:val="0"/>
-              </w:rPr>
-              <w:t xml:space="preserve">Planned</w:t>
-            </w:r>
-            <w:r>
-              <w:rPr>
-                <w:rtl w:val="0"/>
-              </w:rPr>
+            <w:r>
+              <w:t>Planned</w:t>
             </w:r>
           </w:p>
         </w:tc>
@@ -6796,22 +6131,8 @@
             </w:tcBorders>
           </w:tcPr>
           <w:p>
-            <w:pPr>
-              <w:spacing w:after="40" w:before="0" w:lineRule="auto"/>
-              <w:rPr/>
-            </w:pPr>
-            <w:r>
-              <w:rPr>
-                <w:sz w:val="20"/>
-                <w:szCs w:val="20"/>
-                <w:rtl w:val="0"/>
-              </w:rPr>
-              <w:t xml:space="preserve">—</w:t>
-            </w:r>
-            <w:r>
-              <w:rPr>
-                <w:rtl w:val="0"/>
-              </w:rPr>
+            <w:r>
+              <w:t>Project scope</w:t>
             </w:r>
           </w:p>
         </w:tc>
@@ -7069,9 +6390,7 @@
         </w:rPr>
       </w:pPr>
       <w:r>
-        <w:rPr>
-          <w:rtl w:val="0"/>
-        </w:rPr>
+        <w:t>[3] N. Gomez, S. Batham, M. Volonte, and T. D. Do, "Virtual Interviewers, Real Results: Exploring AI-Driven Mock Technical Interviews on Student Readiness and Confidence," Companion of CSCW '25, 2025. doi:10.1145/3715070.3749227.</w:t>
       </w:r>
     </w:p>
     <w:p>
@@ -7080,18 +6399,32 @@
         <w:rPr/>
       </w:pPr>
       <w:r>
-        <w:rPr>
-          <w:sz w:val="22"/>
-          <w:szCs w:val="22"/>
-          <w:highlight w:val="yellow"/>
-          <w:rtl w:val="0"/>
-        </w:rPr>
-        <w:t xml:space="preserve">[3] [PLACEHOLDER: Author(s), "Title," Publisher/Journal, Year. URL or DOI. Date accessed (for web sources).]</w:t>
-      </w:r>
-      <w:r>
-        <w:rPr>
-          <w:rtl w:val="0"/>
-        </w:rPr>
+        <w:t>[4] K. Bhosale, C. Prasad, A. M. Shah, and M. M. Prabhu, "Artificial Intelligence Based Mock Interviews for Performance Improvement," International Journal of Scientific Research and Engineering Trends, vol. 12, no. 1, 2026.</w:t>
+      </w:r>
+    </w:p>
+    <w:p>
+      <w:r>
+        <w:t>[5] LinkedIn Help, "About Learning Paths on LinkedIn Learning." https://www.linkedin.com/help/learning/answer/a561001 (accessed Oct. 28, 2026).</w:t>
+      </w:r>
+    </w:p>
+    <w:p>
+      <w:r>
+        <w:t>[6] LinkedIn Help, "LinkedIn Skill Assessments." https://www.linkedin.com/help/linkedin/answer/a507663 (accessed Oct. 28, 2026).</w:t>
+      </w:r>
+    </w:p>
+    <w:p>
+      <w:r>
+        <w:t>[7] LinkedIn Help, "LinkedIn Interview Preparation." https://www.linkedin.com/help/linkedin/answer/87760 (accessed Oct. 28, 2026).</w:t>
+      </w:r>
+    </w:p>
+    <w:p>
+      <w:r>
+        <w:t>[8] Google, "Helping job seekers prepare for interviews," The Keyword (Grow with Google), 2022. https://blog.google/company-news/outreach-and-initiatives/grow-with-google/interview-warmup/ (accessed Oct. 28, 2026).</w:t>
+      </w:r>
+    </w:p>
+    <w:p>
+      <w:r>
+        <w:t>[9] Google, "How to prepare for an interview," Grow with Google. https://grow.google/grow-your-career/articles/interview-tips/ (accessed Oct. 28, 2026).</w:t>
       </w:r>
     </w:p>
     <w:sectPr>

</xml_diff>

<commit_message>
Remove signature names and embedded images from document
Co-authored-by: mr2482-dev <245424622+mr2482-dev@users.noreply.github.com>
</commit_message>
<xml_diff>
--- a/DevPath_Chapters_1-2_Draft shahd.docx
+++ b/DevPath_Chapters_1-2_Draft shahd.docx
@@ -69,90 +69,6 @@
           <w:rtl w:val="0"/>
         </w:rPr>
       </w:r>
-      <w:r>
-        <w:drawing>
-          <wp:anchor allowOverlap="1" behindDoc="0" distB="0" distT="0" distL="0" distR="0" hidden="0" layoutInCell="1" locked="0" relativeHeight="0" simplePos="0">
-            <wp:simplePos x="0" y="0"/>
-            <wp:positionH relativeFrom="column">
-              <wp:posOffset>274320</wp:posOffset>
-            </wp:positionH>
-            <wp:positionV relativeFrom="paragraph">
-              <wp:posOffset>41275</wp:posOffset>
-            </wp:positionV>
-            <wp:extent cx="908685" cy="1033145"/>
-            <wp:effectExtent b="0" l="0" r="0" t="0"/>
-            <wp:wrapSquare wrapText="bothSides" distB="0" distT="0" distL="0" distR="0"/>
-            <wp:docPr id="7" name="image1.png"/>
-            <a:graphic>
-              <a:graphicData uri="http://schemas.openxmlformats.org/drawingml/2006/picture">
-                <pic:pic>
-                  <pic:nvPicPr>
-                    <pic:cNvPr id="0" name="image1.png"/>
-                    <pic:cNvPicPr preferRelativeResize="0"/>
-                  </pic:nvPicPr>
-                  <pic:blipFill>
-                    <a:blip r:embed="rId7"/>
-                    <a:srcRect b="4321" l="8598" r="9909" t="3024"/>
-                    <a:stretch>
-                      <a:fillRect/>
-                    </a:stretch>
-                  </pic:blipFill>
-                  <pic:spPr>
-                    <a:xfrm>
-                      <a:off x="0" y="0"/>
-                      <a:ext cx="908685" cy="1033145"/>
-                    </a:xfrm>
-                    <a:prstGeom prst="rect"/>
-                    <a:ln/>
-                  </pic:spPr>
-                </pic:pic>
-              </a:graphicData>
-            </a:graphic>
-          </wp:anchor>
-        </w:drawing>
-      </w:r>
-      <w:r>
-        <w:drawing>
-          <wp:anchor allowOverlap="1" behindDoc="0" distB="0" distT="0" distL="0" distR="0" hidden="0" layoutInCell="1" locked="0" relativeHeight="0" simplePos="0">
-            <wp:simplePos x="0" y="0"/>
-            <wp:positionH relativeFrom="column">
-              <wp:posOffset>3952240</wp:posOffset>
-            </wp:positionH>
-            <wp:positionV relativeFrom="paragraph">
-              <wp:posOffset>-36829</wp:posOffset>
-            </wp:positionV>
-            <wp:extent cx="822960" cy="1111250"/>
-            <wp:effectExtent b="0" l="0" r="0" t="0"/>
-            <wp:wrapSquare wrapText="bothSides" distB="0" distT="0" distL="0" distR="0"/>
-            <wp:docPr id="8" name="image3.png"/>
-            <a:graphic>
-              <a:graphicData uri="http://schemas.openxmlformats.org/drawingml/2006/picture">
-                <pic:pic>
-                  <pic:nvPicPr>
-                    <pic:cNvPr id="0" name="image3.png"/>
-                    <pic:cNvPicPr preferRelativeResize="0"/>
-                  </pic:nvPicPr>
-                  <pic:blipFill>
-                    <a:blip r:embed="rId8"/>
-                    <a:srcRect b="13244" l="17998" r="24597" t="9230"/>
-                    <a:stretch>
-                      <a:fillRect/>
-                    </a:stretch>
-                  </pic:blipFill>
-                  <pic:spPr>
-                    <a:xfrm>
-                      <a:off x="0" y="0"/>
-                      <a:ext cx="822960" cy="1111250"/>
-                    </a:xfrm>
-                    <a:prstGeom prst="rect"/>
-                    <a:ln/>
-                  </pic:spPr>
-                </pic:pic>
-              </a:graphicData>
-            </a:graphic>
-          </wp:anchor>
-        </w:drawing>
-      </w:r>
     </w:p>
     <w:p>
       <w:pPr>
@@ -188,48 +104,6 @@
         <w:rPr>
           <w:rtl w:val="0"/>
         </w:rPr>
-      </w:r>
-      <w:r>
-        <w:drawing>
-          <wp:anchor allowOverlap="1" behindDoc="0" distB="0" distT="0" distL="0" distR="0" hidden="0" layoutInCell="1" locked="0" relativeHeight="0" simplePos="0">
-            <wp:simplePos x="0" y="0"/>
-            <wp:positionH relativeFrom="column">
-              <wp:posOffset>1722120</wp:posOffset>
-            </wp:positionH>
-            <wp:positionV relativeFrom="paragraph">
-              <wp:posOffset>-57149</wp:posOffset>
-            </wp:positionV>
-            <wp:extent cx="1732280" cy="1377315"/>
-            <wp:effectExtent b="0" l="0" r="0" t="0"/>
-            <wp:wrapSquare wrapText="bothSides" distB="0" distT="0" distL="0" distR="0"/>
-            <wp:docPr id="6" name="image2.png"/>
-            <a:graphic>
-              <a:graphicData uri="http://schemas.openxmlformats.org/drawingml/2006/picture">
-                <pic:pic>
-                  <pic:nvPicPr>
-                    <pic:cNvPr id="0" name="image2.png"/>
-                    <pic:cNvPicPr preferRelativeResize="0"/>
-                  </pic:nvPicPr>
-                  <pic:blipFill>
-                    <a:blip r:embed="rId9"/>
-                    <a:srcRect b="22050" l="14052" r="13932" t="20705"/>
-                    <a:stretch>
-                      <a:fillRect/>
-                    </a:stretch>
-                  </pic:blipFill>
-                  <pic:spPr>
-                    <a:xfrm>
-                      <a:off x="0" y="0"/>
-                      <a:ext cx="1732280" cy="1377315"/>
-                    </a:xfrm>
-                    <a:prstGeom prst="rect"/>
-                    <a:ln/>
-                  </pic:spPr>
-                </pic:pic>
-              </a:graphicData>
-            </a:graphic>
-          </wp:anchor>
-        </w:drawing>
       </w:r>
     </w:p>
     <w:p>
@@ -398,21 +272,7 @@
         <w:jc w:val="center"/>
         <w:rPr/>
       </w:pPr>
-      <w:r>
-        <w:rPr>
-          <w:b w:val="1"/>
-          <w:bCs w:val="1"/>
-          <w:sz w:val="26"/>
-          <w:szCs w:val="26"/>
-          <w:rtl w:val="0"/>
-        </w:rPr>
-        <w:t xml:space="preserve">By:</w:t>
-      </w:r>
-      <w:r>
-        <w:rPr>
-          <w:rtl w:val="0"/>
-        </w:rPr>
-      </w:r>
+      <w:r/>
     </w:p>
     <w:p>
       <w:pPr>
@@ -420,20 +280,7 @@
         <w:jc w:val="center"/>
         <w:rPr/>
       </w:pPr>
-      <w:r>
-        <w:rPr>
-          <w:sz w:val="24"/>
-          <w:szCs w:val="24"/>
-          <w:shd w:fill="auto" w:val="clear"/>
-          <w:rtl w:val="0"/>
-        </w:rPr>
-        <w:t xml:space="preserve">Yousef Yasser Saad</w:t>
-      </w:r>
-      <w:r>
-        <w:rPr>
-          <w:rtl w:val="0"/>
-        </w:rPr>
-      </w:r>
+      <w:r/>
     </w:p>
     <w:p>
       <w:pPr>
@@ -441,20 +288,7 @@
         <w:jc w:val="center"/>
         <w:rPr/>
       </w:pPr>
-      <w:r>
-        <w:rPr>
-          <w:sz w:val="24"/>
-          <w:szCs w:val="24"/>
-          <w:shd w:fill="auto" w:val="clear"/>
-          <w:rtl w:val="0"/>
-        </w:rPr>
-        <w:t xml:space="preserve">Shahd Hani Hussien</w:t>
-      </w:r>
-      <w:r>
-        <w:rPr>
-          <w:rtl w:val="0"/>
-        </w:rPr>
-      </w:r>
+      <w:r/>
     </w:p>
     <w:p>
       <w:pPr>
@@ -462,20 +296,7 @@
         <w:jc w:val="center"/>
         <w:rPr/>
       </w:pPr>
-      <w:r>
-        <w:rPr>
-          <w:sz w:val="24"/>
-          <w:szCs w:val="24"/>
-          <w:shd w:fill="auto" w:val="clear"/>
-          <w:rtl w:val="0"/>
-        </w:rPr>
-        <w:t xml:space="preserve">Yousef Ali Farouk</w:t>
-      </w:r>
-      <w:r>
-        <w:rPr>
-          <w:rtl w:val="0"/>
-        </w:rPr>
-      </w:r>
+      <w:r/>
     </w:p>
     <w:p>
       <w:pPr>
@@ -483,20 +304,7 @@
         <w:jc w:val="center"/>
         <w:rPr/>
       </w:pPr>
-      <w:r>
-        <w:rPr>
-          <w:sz w:val="24"/>
-          <w:szCs w:val="24"/>
-          <w:shd w:fill="auto" w:val="clear"/>
-          <w:rtl w:val="0"/>
-        </w:rPr>
-        <w:t xml:space="preserve">Mohammed Saeed Abdelrahman</w:t>
-      </w:r>
-      <w:r>
-        <w:rPr>
-          <w:rtl w:val="0"/>
-        </w:rPr>
-      </w:r>
+      <w:r/>
     </w:p>
     <w:p>
       <w:pPr>
@@ -504,20 +312,7 @@
         <w:jc w:val="center"/>
         <w:rPr/>
       </w:pPr>
-      <w:r>
-        <w:rPr>
-          <w:sz w:val="24"/>
-          <w:szCs w:val="24"/>
-          <w:shd w:fill="auto" w:val="clear"/>
-          <w:rtl w:val="0"/>
-        </w:rPr>
-        <w:t xml:space="preserve">Mohammed Fathi Mahmoud</w:t>
-      </w:r>
-      <w:r>
-        <w:rPr>
-          <w:rtl w:val="0"/>
-        </w:rPr>
-      </w:r>
+      <w:r/>
     </w:p>
     <w:p>
       <w:pPr>
@@ -525,20 +320,7 @@
         <w:jc w:val="center"/>
         <w:rPr/>
       </w:pPr>
-      <w:r>
-        <w:rPr>
-          <w:sz w:val="24"/>
-          <w:szCs w:val="24"/>
-          <w:shd w:fill="auto" w:val="clear"/>
-          <w:rtl w:val="0"/>
-        </w:rPr>
-        <w:t xml:space="preserve">Mohammed Ramadan Salah</w:t>
-      </w:r>
-      <w:r>
-        <w:rPr>
-          <w:rtl w:val="0"/>
-        </w:rPr>
-      </w:r>
+      <w:r/>
     </w:p>
     <w:p>
       <w:pPr>

</xml_diff>